<commit_message>
Monsterbanor och varierande svårighet
Svårigheten varierar från bana till bana. Vissa banor har ett monster som jagar
i stället för tidsgräns. Spec uppdaterad till version 0.3.

Co-Authored-By: Claude Sonnet 5.5 <noreply@anthropic.com>
Claude-Session: https://claude.ai/code/session_01P9bR1QdvvjTKHNj3Z4CUgp
</commit_message>
<xml_diff>
--- a/docs/Maze-Memory-spec.docx
+++ b/docs/Maze-Memory-spec.docx
@@ -28,7 +28,7 @@
         <w:t xml:space="preserve">Version: </w:t>
       </w:r>
       <w:r>
-        <w:t>0.2 – Beslut efter första bollningen, webbprototyp påbörjad</w:t>
+        <w:t>0.3 – Monsterbanor och varierande svårighet</w:t>
         <w:br/>
       </w:r>
       <w:r>
@@ -372,6 +372,54 @@
         <w:pStyle w:val="Heading1"/>
       </w:pPr>
       <w:r>
+        <w:t>5b. Monsterbanor</w:t>
+      </w:r>
+    </w:p>
+    <w:p>
+      <w:pPr>
+        <w:pStyle w:val="ListBullet"/>
+      </w:pPr>
+      <w:r>
+        <w:t>Vissa banor har ingen tidsgräns. I stället väcks ett monster vid starten efter några sekunder och jagar spelaren längs kortaste vägen.</w:t>
+      </w:r>
+    </w:p>
+    <w:p>
+      <w:pPr>
+        <w:pStyle w:val="ListBullet"/>
+      </w:pPr>
+      <w:r>
+        <w:t>Monstret är långsammare än figuren, men figuren tappar tid vid varje vägval och vid felval. Går man in i en återvändsgränd får man springa tillbaka mot monstret.</w:t>
+      </w:r>
+    </w:p>
+    <w:p>
+      <w:pPr>
+        <w:pStyle w:val="ListBullet"/>
+      </w:pPr>
+      <w:r>
+        <w:t>Fart och försprång beräknas så att en spelare som kan vägen klarar sig med marginal. Marginalen är mindre på Svår och på svårare banor.</w:t>
+      </w:r>
+    </w:p>
+    <w:p>
+      <w:pPr>
+        <w:pStyle w:val="ListBullet"/>
+      </w:pPr>
+      <w:r>
+        <w:t>Skärmkanten blir röd när monstret är nära. Om monstret hinner ikapp förlorar spelaren ett liv.</w:t>
+      </w:r>
+    </w:p>
+    <w:p>
+      <w:pPr>
+        <w:pStyle w:val="ListBullet"/>
+      </w:pPr>
+      <w:r>
+        <w:t>Första monsterbanan är bana 4. Därefter är cirka 40 % av banorna monsterbanor.</w:t>
+      </w:r>
+    </w:p>
+    <w:p>
+      <w:pPr>
+        <w:pStyle w:val="Heading1"/>
+      </w:pPr>
+      <w:r>
         <w:t>6. Svårighetsgrader</w:t>
       </w:r>
     </w:p>
@@ -595,7 +643,7 @@
         <w:pStyle w:val="ListBullet"/>
       </w:pPr>
       <w:r>
-        <w:t>Bana 1 är 5×5 och storleken ökar successivt upp till 13×14.</w:t>
+        <w:t>Beslut: Svårigheten ska variera. Den stiger långsamt, men varje bana får också ett slumpat men fast utslag. Var femte bana är tuff och banan efter är en andningspaus.</w:t>
       </w:r>
     </w:p>
     <w:p>
@@ -603,7 +651,15 @@
         <w:pStyle w:val="ListBullet"/>
       </w:pPr>
       <w:r>
-        <w:t>Från bana 4 läggs extra förbindelser in, så att det finns flera vägar.</w:t>
+        <w:t>Svårigheten styr storlek (5×5 upp till 28×28), antal extra förbindelser och hur snäv tidsgränsen eller monstret är.</w:t>
+      </w:r>
+    </w:p>
+    <w:p>
+      <w:pPr>
+        <w:pStyle w:val="ListBullet"/>
+      </w:pPr>
+      <w:r>
+        <w:t>Extra förbindelser läggs in på svårare banor, så att det finns flera vägar.</w:t>
       </w:r>
     </w:p>
     <w:p>

</xml_diff>

<commit_message>
Gömställen (tunnor) på monsterbanor
Co-Authored-By: Claude Sonnet 5.5 <noreply@anthropic.com>
Claude-Session: https://claude.ai/code/session_01P9bR1QdvvjTKHNj3Z4CUgp
</commit_message>
<xml_diff>
--- a/docs/Maze-Memory-spec.docx
+++ b/docs/Maze-Memory-spec.docx
@@ -28,7 +28,7 @@
         <w:t xml:space="preserve">Version: </w:t>
       </w:r>
       <w:r>
-        <w:t>0.3 – Monsterbanor och varierande svårighet</w:t>
+        <w:t>0.4 – Monsterbanor, gömställen och varierande svårighet</w:t>
         <w:br/>
       </w:r>
       <w:r>
@@ -413,6 +413,54 @@
       </w:pPr>
       <w:r>
         <w:t>Första monsterbanan är bana 4. Därefter är cirka 40 % av banorna monsterbanor.</w:t>
+      </w:r>
+    </w:p>
+    <w:p>
+      <w:pPr>
+        <w:pStyle w:val="ListBullet"/>
+      </w:pPr>
+      <w:r>
+        <w:t>Backspegel: en liten ruta visar vyn bakåt så att spelaren kan se var monstret är utan att kameran vrids.</w:t>
+      </w:r>
+    </w:p>
+    <w:p>
+      <w:pPr>
+        <w:pStyle w:val="Heading1"/>
+      </w:pPr>
+      <w:r>
+        <w:t>5c. Gömställen</w:t>
+      </w:r>
+    </w:p>
+    <w:p>
+      <w:pPr>
+        <w:pStyle w:val="ListBullet"/>
+      </w:pPr>
+      <w:r>
+        <w:t>I några återvändsgränder på monsterbanorna står en tunna med en orange ring. De syns på kartan under studietiden, så spelaren kan memorera dem.</w:t>
+      </w:r>
+    </w:p>
+    <w:p>
+      <w:pPr>
+        <w:pStyle w:val="ListBullet"/>
+      </w:pPr>
+      <w:r>
+        <w:t>Vid en tunna visas knappen Göm dig. Om monstret är längre bort än 3 rutor tappar det bort spelaren och går och letar i 6–10 sekunder, beroende på svårighet. Är det närmare ser det spelaren och kommer ändå.</w:t>
+      </w:r>
+    </w:p>
+    <w:p>
+      <w:pPr>
+        <w:pStyle w:val="ListBullet"/>
+      </w:pPr>
+      <w:r>
+        <w:t>Spelaren kan komma fram när som helst. Om monstret hunnit sluta leta är det på väg igen.</w:t>
+      </w:r>
+    </w:p>
+    <w:p>
+      <w:pPr>
+        <w:pStyle w:val="ListBullet"/>
+      </w:pPr>
+      <w:r>
+        <w:t>Varje tunna kan användas en gång, så att man inte kan gömma sig för evigt.</w:t>
       </w:r>
     </w:p>
     <w:p>

</xml_diff>

<commit_message>
Spec v0.8: meny, figurer, landmärken och teman
Co-Authored-By: Claude Sonnet 5.5 <noreply@anthropic.com>
Claude-Session: https://claude.ai/code/session_01P9bR1QdvvjTKHNj3Z4CUgp
</commit_message>
<xml_diff>
--- a/docs/Maze-Memory-spec.docx
+++ b/docs/Maze-Memory-spec.docx
@@ -28,7 +28,7 @@
         <w:t xml:space="preserve">Version: </w:t>
       </w:r>
       <w:r>
-        <w:t>0.4 – Monsterbanor, gömställen och varierande svårighet</w:t>
+        <w:t>0.8 – Meny, figurer, landmärken och teman</w:t>
         <w:br/>
       </w:r>
       <w:r>
@@ -461,6 +461,166 @@
       </w:pPr>
       <w:r>
         <w:t>Varje tunna kan användas en gång, så att man inte kan gömma sig för evigt.</w:t>
+      </w:r>
+    </w:p>
+    <w:p>
+      <w:pPr>
+        <w:pStyle w:val="Heading1"/>
+      </w:pPr>
+      <w:r>
+        <w:t>5d. Meny och figurer</w:t>
+      </w:r>
+    </w:p>
+    <w:p>
+      <w:pPr>
+        <w:pStyle w:val="ListBullet"/>
+      </w:pPr>
+      <w:r>
+        <w:t>Menyn är en bankarta: en slingrande grusgång genom häckar där varje bana är en rund skylt. Färgen visar typ (grön lätt, orange medel, röd svår, lila monster) och stjärnorna syns under skylten. Man ser flera banor framåt och temats namn står under kartan.</w:t>
+      </w:r>
+    </w:p>
+    <w:p>
+      <w:pPr>
+        <w:pStyle w:val="ListBullet"/>
+      </w:pPr>
+      <w:r>
+        <w:t>Just nu kan man hoppa fritt mellan banor. Senare ska man klara en bana för att komma vidare.</w:t>
+      </w:r>
+    </w:p>
+    <w:p>
+      <w:pPr>
+        <w:pStyle w:val="ListBullet"/>
+      </w:pPr>
+      <w:r>
+        <w:t>Inställningar för spelläge, tempo (lugnt, normalt, snabbt) och testinställningar ligger bakom ett tandhjul.</w:t>
+      </w:r>
+    </w:p>
+    <w:p>
+      <w:pPr>
+        <w:pStyle w:val="ListBullet"/>
+      </w:pPr>
+      <w:r>
+        <w:t>Figurer att välja: kille, tjej, katt, hund och häst. Kille och tjej är öppna, de andra låses upp med stjärnor (6, 15 och 30). Figuren ändrar bara utseende, inte spelet.</w:t>
+      </w:r>
+    </w:p>
+    <w:p>
+      <w:pPr>
+        <w:pStyle w:val="ListBullet"/>
+      </w:pPr>
+      <w:r>
+        <w:t>Figuren ska visa personlighet även bakifrån: den tittar bakåt över axeln när den springer, vinkar mot kameran när den väntar, blinkar och har tofsar, svans eller öron som rör sig.</w:t>
+      </w:r>
+    </w:p>
+    <w:p>
+      <w:pPr>
+        <w:pStyle w:val="ListBullet"/>
+      </w:pPr>
+      <w:r>
+        <w:t>I kartvyn finns en tillbakaknapp till menyn. Den kostar inget liv eftersom spelaren inte har börjat spela.</w:t>
+      </w:r>
+    </w:p>
+    <w:p>
+      <w:pPr>
+        <w:pStyle w:val="Heading1"/>
+      </w:pPr>
+      <w:r>
+        <w:t>5e. Landmärken</w:t>
+      </w:r>
+    </w:p>
+    <w:p>
+      <w:pPr>
+        <w:pStyle w:val="ListBullet"/>
+      </w:pPr>
+      <w:r>
+        <w:t>Banorna har landmärken som gör vägen lättare att minnas, till exempel "efter den blå grinden" eller "förbi lyktan".</w:t>
+      </w:r>
+    </w:p>
+    <w:p>
+      <w:pPr>
+        <w:pStyle w:val="ListBullet"/>
+      </w:pPr>
+      <w:r>
+        <w:t>Sex olika landmärken: blå grind (spänner över gången), äppelträd, lykta, staty, flagga och solros. Alla utom grinden står mot en häck och sticker upp över den, så de syns både från ovan och nere i labyrinten. Inget landmärke förekommer två gånger i samma bana.</w:t>
+      </w:r>
+    </w:p>
+    <w:p>
+      <w:pPr>
+        <w:pStyle w:val="ListBullet"/>
+      </w:pPr>
+      <w:r>
+        <w:t>Två tredjedelar står längs rätt väg och resten vid sidovägar, så att de även kan varna för felväg.</w:t>
+      </w:r>
+    </w:p>
+    <w:p>
+      <w:pPr>
+        <w:pStyle w:val="ListBullet"/>
+      </w:pPr>
+      <w:r>
+        <w:t>Antalet ökar med svårigheten, från 2 på lätta banor till 6 på svåra.</w:t>
+      </w:r>
+    </w:p>
+    <w:p>
+      <w:pPr>
+        <w:pStyle w:val="ListBullet"/>
+      </w:pPr>
+      <w:r>
+        <w:t>På kartan under studietiden visas en liten ikon över varje landmärke. Ikonerna försvinner när spelet börjar.</w:t>
+      </w:r>
+    </w:p>
+    <w:p>
+      <w:pPr>
+        <w:pStyle w:val="Heading1"/>
+      </w:pPr>
+      <w:r>
+        <w:t>5f. Teman</w:t>
+      </w:r>
+    </w:p>
+    <w:p>
+      <w:pPr>
+        <w:pStyle w:val="ListBullet"/>
+      </w:pPr>
+      <w:r>
+        <w:t>Varje bana har ett tema som ändrar väggar, golv, himmel och dimma. Samma bana har alltid samma tema.</w:t>
+      </w:r>
+    </w:p>
+    <w:p>
+      <w:pPr>
+        <w:pStyle w:val="ListBullet"/>
+      </w:pPr>
+      <w:r>
+        <w:t>Elva teman: Häck (bana 1 och klassisk), Blommande buskar, Tegelmur, Galleri (inomhus med tavlor och parkettgolv), Höstlöv, Snöhäck, Stenmur, Bibliotek (bokhyllor och röd matta), Godisland, Korallgrotta och Rymdstation.</w:t>
+      </w:r>
+    </w:p>
+    <w:p>
+      <w:pPr>
+        <w:pStyle w:val="ListBullet"/>
+      </w:pPr>
+      <w:r>
+        <w:t>Säsongsteman som pepparkaksbyn för jul sparas till säsongsuppdateringar av appen. Höstlöv och Snöhäck kan flyttas dit senare.</w:t>
+      </w:r>
+    </w:p>
+    <w:p>
+      <w:pPr>
+        <w:pStyle w:val="ListBullet"/>
+      </w:pPr>
+      <w:r>
+        <w:t>Temana återkommer jämnt i omgångar om elva banor och samma tema kommer aldrig två gånger i rad.</w:t>
+      </w:r>
+    </w:p>
+    <w:p>
+      <w:pPr>
+        <w:pStyle w:val="ListBullet"/>
+      </w:pPr>
+      <w:r>
+        <w:t>Kartvyn ska vara lika lätt att läsa i alla teman. Väggarnas ovansida har därför en egen, jämn färg i de teman där sidorna är detaljerade.</w:t>
+      </w:r>
+    </w:p>
+    <w:p>
+      <w:pPr>
+        <w:pStyle w:val="ListBullet"/>
+      </w:pPr>
+      <w:r>
+        <w:t>Väggen som skymmer figuren sänks till knähöjd i stället för att bli genomskinlig, eftersom genomskinliga väggar såg ut som öppningar när kameran svängde.</w:t>
       </w:r>
     </w:p>
     <w:p>

</xml_diff>

<commit_message>
Väder (sol, regn, snö, dimma, blåst) och tillbehör till figuren
Partikeleffekter, ändrad himmel, ljus och dimma. Specen v0.9.

Co-Authored-By: Claude Sonnet 5.5 <noreply@anthropic.com>
Claude-Session: https://claude.ai/code/session_01P9bR1QdvvjTKHNj3Z4CUgp
</commit_message>
<xml_diff>
--- a/docs/Maze-Memory-spec.docx
+++ b/docs/Maze-Memory-spec.docx
@@ -28,7 +28,7 @@
         <w:t xml:space="preserve">Version: </w:t>
       </w:r>
       <w:r>
-        <w:t>0.8 – Meny, figurer, landmärken och teman</w:t>
+        <w:t>0.9 – Väder och tillbehör</w:t>
         <w:br/>
       </w:r>
       <w:r>
@@ -621,6 +621,54 @@
       </w:pPr>
       <w:r>
         <w:t>Väggen som skymmer figuren sänks till knähöjd i stället för att bli genomskinlig, eftersom genomskinliga väggar såg ut som öppningar när kameran svängde.</w:t>
+      </w:r>
+    </w:p>
+    <w:p>
+      <w:pPr>
+        <w:pStyle w:val="Heading1"/>
+      </w:pPr>
+      <w:r>
+        <w:t>5g. Väder och tillbehör</w:t>
+      </w:r>
+    </w:p>
+    <w:p>
+      <w:pPr>
+        <w:pStyle w:val="ListBullet"/>
+      </w:pPr>
+      <w:r>
+        <w:t>Varje bana har ett väder som ändrar himmel, ljus, dimma och partiklar: sol, regn, snöfall, dimma eller blåst. Vädret är fast per bana. De tre första banorna har alltid sol.</w:t>
+      </w:r>
+    </w:p>
+    <w:p>
+      <w:pPr>
+        <w:pStyle w:val="ListBullet"/>
+      </w:pPr>
+      <w:r>
+        <w:t>Teman som utspelar sig inomhus eller under vatten (Galleri, Bibliotek, Godisland, Korallgrotta, Rymdstation) har inget väder.</w:t>
+      </w:r>
+    </w:p>
+    <w:p>
+      <w:pPr>
+        <w:pStyle w:val="ListBullet"/>
+      </w:pPr>
+      <w:r>
+        <w:t>Dimma kortar den sikt man har framför sig, så den banan blir något svårare. De andra vädren är bara utseende.</w:t>
+      </w:r>
+    </w:p>
+    <w:p>
+      <w:pPr>
+        <w:pStyle w:val="ListBullet"/>
+      </w:pPr>
+      <w:r>
+        <w:t>Figuren får tillbehör efter vädret, så att de syns även bakifrån: solhatt och solglasögon i sol, gul regnrock med huva, röda stövlar och ett paraply vid sidan i regn, blå mössa och röd halsduk i snö, lykta i handen i dimma och grön keps med fladdrande halsduk i blåst.</w:t>
+      </w:r>
+    </w:p>
+    <w:p>
+      <w:pPr>
+        <w:pStyle w:val="ListBullet"/>
+      </w:pPr>
+      <w:r>
+        <w:t>Banans väder visas med en liten symbol i menyn och uppe i spelet.</w:t>
       </w:r>
     </w:p>
     <w:p>

</xml_diff>

<commit_message>
Snöfort, bättre korallgrotta och galleri, sol på himlen, paraply över huvudet
Inget regn i snöfortet, snabb vändning i stället för klipp, bubblor i korallgrottan.
Specen v1.0.

Co-Authored-By: Claude Sonnet 5.5 <noreply@anthropic.com>
Claude-Session: https://claude.ai/code/session_01P9bR1QdvvjTKHNj3Z4CUgp
</commit_message>
<xml_diff>
--- a/docs/Maze-Memory-spec.docx
+++ b/docs/Maze-Memory-spec.docx
@@ -28,7 +28,7 @@
         <w:t xml:space="preserve">Version: </w:t>
       </w:r>
       <w:r>
-        <w:t>0.9 – Väder och tillbehör</w:t>
+        <w:t>1.0 – Snöfort, bättre korall och galleri, sol på himlen</w:t>
         <w:br/>
       </w:r>
       <w:r>
@@ -588,7 +588,7 @@
         <w:pStyle w:val="ListBullet"/>
       </w:pPr>
       <w:r>
-        <w:t>Elva teman: Häck (bana 1 och klassisk), Blommande buskar, Tegelmur, Galleri (inomhus med tavlor och parkettgolv), Höstlöv, Snöhäck, Stenmur, Bibliotek (bokhyllor och röd matta), Godisland, Korallgrotta och Rymdstation.</w:t>
+        <w:t>Elva teman: Häck (bana 1 och klassisk), Blommande buskar, Tegelmur, Galleri (inomhus med tavlor och parkettgolv), Höstlöv, Snöfort (väggar av isblock), Stenmur, Bibliotek (bokhyllor och röd matta), Godisland, Korallgrotta och Rymdstation.</w:t>
       </w:r>
     </w:p>
     <w:p>
@@ -596,7 +596,7 @@
         <w:pStyle w:val="ListBullet"/>
       </w:pPr>
       <w:r>
-        <w:t>Säsongsteman som pepparkaksbyn för jul sparas till säsongsuppdateringar av appen. Höstlöv och Snöhäck kan flyttas dit senare.</w:t>
+        <w:t>Säsongsteman som pepparkaksbyn för jul sparas till säsongsuppdateringar av appen. Höstlöv och Snöfort kan flyttas dit senare.</w:t>
       </w:r>
     </w:p>
     <w:p>
@@ -669,6 +669,62 @@
       </w:pPr>
       <w:r>
         <w:t>Banans väder visas med en liten symbol i menyn och uppe i spelet.</w:t>
+      </w:r>
+    </w:p>
+    <w:p>
+      <w:pPr>
+        <w:pStyle w:val="Heading1"/>
+      </w:pPr>
+      <w:r>
+        <w:t>5h. Detaljer i teman och väder</w:t>
+      </w:r>
+    </w:p>
+    <w:p>
+      <w:pPr>
+        <w:pStyle w:val="ListBullet"/>
+      </w:pPr>
+      <w:r>
+        <w:t>Galleriet har roliga tavlor: en banan som sitter fast med tejp, en herre med enormt mustasch, en katt med monokel och fluga och ett porträtt av en potatis.</w:t>
+      </w:r>
+    </w:p>
+    <w:p>
+      <w:pPr>
+        <w:pStyle w:val="ListBullet"/>
+      </w:pPr>
+      <w:r>
+        <w:t>Korallgrottan har grenkorall, solfjädrar, anemoner, små fiskar, sandgolv med ljusnät, snäckor och sjöstjärnor, ljusstrålar i vattnet och bubblor som stiger.</w:t>
+      </w:r>
+    </w:p>
+    <w:p>
+      <w:pPr>
+        <w:pStyle w:val="ListBullet"/>
+      </w:pPr>
+      <w:r>
+        <w:t>Vid sol är himlen klarblå med en sol. Solen sitter i himlen och skyms av häckarna.</w:t>
+      </w:r>
+    </w:p>
+    <w:p>
+      <w:pPr>
+        <w:pStyle w:val="ListBullet"/>
+      </w:pPr>
+      <w:r>
+        <w:t>Det regnar aldrig i Snöfortet. Där kan det vara sol, snöfall, dimma eller blåst.</w:t>
+      </w:r>
+    </w:p>
+    <w:p>
+      <w:pPr>
+        <w:pStyle w:val="ListBullet"/>
+      </w:pPr>
+      <w:r>
+        <w:t>Paraplyet i regn hålls över huvudet.</w:t>
+      </w:r>
+    </w:p>
+    <w:p>
+      <w:pPr>
+        <w:pStyle w:val="ListBullet"/>
+      </w:pPr>
+      <w:r>
+        <w:t>Vid en vändning vrider sig kameran snabbt (cirka en halv sekund) i stället för att göra en långsam sväng eller ett klipp.</w:t>
       </w:r>
     </w:p>
     <w:p>

</xml_diff>

<commit_message>
Väggar som skymmer figuren blir halvgenomskinliga i stället för att sänkas
Väggarna bakom figuren förblir solida. Specen v1.1.

Co-Authored-By: Claude Sonnet 5.5 <noreply@anthropic.com>
Claude-Session: https://claude.ai/code/session_01P9bR1QdvvjTKHNj3Z4CUgp
</commit_message>
<xml_diff>
--- a/docs/Maze-Memory-spec.docx
+++ b/docs/Maze-Memory-spec.docx
@@ -28,7 +28,7 @@
         <w:t xml:space="preserve">Version: </w:t>
       </w:r>
       <w:r>
-        <w:t>1.0 – Snöfort, bättre korall och galleri, sol på himlen</w:t>
+        <w:t>1.1 – Halvgenomskinliga väggar som skymmer</w:t>
         <w:br/>
       </w:r>
       <w:r>
@@ -620,7 +620,7 @@
         <w:pStyle w:val="ListBullet"/>
       </w:pPr>
       <w:r>
-        <w:t>Väggen som skymmer figuren sänks till knähöjd i stället för att bli genomskinlig, eftersom genomskinliga väggar såg ut som öppningar när kameran svängde.</w:t>
+        <w:t>Väggar mellan kameran och figuren blir halvgenomskinliga (cirka 40 % synliga) så att figuren syns, medan väggar bakom figuren är solida. De görs inte helt genomskinliga eftersom det såg ut som öppningar när kameran svängde. De är genomskinliga en stund så att de inte flimrar.</w:t>
       </w:r>
     </w:p>
     <w:p>

</xml_diff>

<commit_message>
Natt med ficklampa och måne, ett monster per tema, monstret letar, förvarning
Åtta olika monster, monstret stannar vid korsningar och kikar in i tunnor, kameran
darrar och skärmkanten pulserar när det närmar sig. Specen v1.2.

Co-Authored-By: Claude Sonnet 5.5 <noreply@anthropic.com>
Claude-Session: https://claude.ai/code/session_01P9bR1QdvvjTKHNj3Z4CUgp
</commit_message>
<xml_diff>
--- a/docs/Maze-Memory-spec.docx
+++ b/docs/Maze-Memory-spec.docx
@@ -28,7 +28,7 @@
         <w:t xml:space="preserve">Version: </w:t>
       </w:r>
       <w:r>
-        <w:t>1.1 – Halvgenomskinliga väggar som skymmer</w:t>
+        <w:t>1.2 – Natt, monster per tema, letande monster</w:t>
         <w:br/>
       </w:r>
       <w:r>
@@ -428,6 +428,38 @@
         <w:pStyle w:val="Heading1"/>
       </w:pPr>
       <w:r>
+        <w:t>5b2. Monstrets personlighet</w:t>
+      </w:r>
+    </w:p>
+    <w:p>
+      <w:pPr>
+        <w:pStyle w:val="ListBullet"/>
+      </w:pPr>
+      <w:r>
+        <w:t>Varje tema har sitt eget monster: klassiskt lila monster i häck och blommor, golem i tegel- och stenmurar, spöke i galleri och bibliotek, pumpa i höstlöv, snögubbe (yeti) i snöfortet, gelébjörn i godisland, krabba i korallgrottan och robot i rymdstationen. Monstret ändrar bara utseende.</w:t>
+      </w:r>
+    </w:p>
+    <w:p>
+      <w:pPr>
+        <w:pStyle w:val="ListBullet"/>
+      </w:pPr>
+      <w:r>
+        <w:t>Efter att spelaren gömt sig tappar monstret bort spelaren och letar. Det går till korsningar i närheten och stannar och tittar sig omkring, och kikar ibland in i andra tunnor (lutar sig framåt) innan det går vidare. Spelaren ser det i backspegeln.</w:t>
+      </w:r>
+    </w:p>
+    <w:p>
+      <w:pPr>
+        <w:pStyle w:val="ListBullet"/>
+      </w:pPr>
+      <w:r>
+        <w:t>Förvarning: kameran darrar och skärmkanten pulserar som ett hjärtslag, allt snabbare och starkare ju närmare monstret kommer. Det blir ett kort skak när monstret vaknar. På telefoner som stöder det vibrerar skärmen när monstret är mycket nära.</w:t>
+      </w:r>
+    </w:p>
+    <w:p>
+      <w:pPr>
+        <w:pStyle w:val="Heading1"/>
+      </w:pPr>
+      <w:r>
         <w:t>5c. Gömställen</w:t>
       </w:r>
     </w:p>
@@ -636,7 +668,7 @@
         <w:pStyle w:val="ListBullet"/>
       </w:pPr>
       <w:r>
-        <w:t>Varje bana har ett väder som ändrar himmel, ljus, dimma och partiklar: sol, regn, snöfall, dimma eller blåst. Vädret är fast per bana. De tre första banorna har alltid sol.</w:t>
+        <w:t>Varje bana har ett väder som ändrar himmel, ljus, dimma och partiklar: sol, regn, snöfall, dimma, blåst eller natt. Vädret är fast per bana. De tre första banorna har alltid sol.</w:t>
       </w:r>
     </w:p>
     <w:p>
@@ -669,6 +701,30 @@
       </w:pPr>
       <w:r>
         <w:t>Banans väder visas med en liten symbol i menyn och uppe i spelet.</w:t>
+      </w:r>
+    </w:p>
+    <w:p>
+      <w:pPr>
+        <w:pStyle w:val="Heading1"/>
+      </w:pPr>
+      <w:r>
+        <w:t>5i. Natt</w:t>
+      </w:r>
+    </w:p>
+    <w:p>
+      <w:pPr>
+        <w:pStyle w:val="ListBullet"/>
+      </w:pPr>
+      <w:r>
+        <w:t>Ibland är det natt: mörk stjärnhimmel med en måne och dämpat månljus. Figuren springer med en ficklampa som lyser upp vägen framför sig, med en svag ljusstråle. Figuren får också ett mjukt ljus så att den syns.</w:t>
+      </w:r>
+    </w:p>
+    <w:p>
+      <w:pPr>
+        <w:pStyle w:val="ListBullet"/>
+      </w:pPr>
+      <w:r>
+        <w:t>Natt är ett väder och väljs per bana som de andra vädren. Det förekommer inte i inomhusteman.</w:t>
       </w:r>
     </w:p>
     <w:p>

</xml_diff>

<commit_message>
Snyggare rymdstation med glödande paneler, nebulosa och rymdhjälm
Specen v1.3.

Co-Authored-By: Claude Sonnet 5.5 <noreply@anthropic.com>
Claude-Session: https://claude.ai/code/session_01P9bR1QdvvjTKHNj3Z4CUgp
</commit_message>
<xml_diff>
--- a/docs/Maze-Memory-spec.docx
+++ b/docs/Maze-Memory-spec.docx
@@ -28,7 +28,7 @@
         <w:t xml:space="preserve">Version: </w:t>
       </w:r>
       <w:r>
-        <w:t>1.2 – Natt, monster per tema, letande monster</w:t>
+        <w:t>1.3 – Snyggare rymdstation med rymdhjälm</w:t>
         <w:br/>
       </w:r>
       <w:r>
@@ -725,6 +725,38 @@
       </w:pPr>
       <w:r>
         <w:t>Natt är ett väder och väljs per bana som de andra vädren. Det förekommer inte i inomhusteman.</w:t>
+      </w:r>
+    </w:p>
+    <w:p>
+      <w:pPr>
+        <w:pStyle w:val="Heading1"/>
+      </w:pPr>
+      <w:r>
+        <w:t>5j. Rymdstationen</w:t>
+      </w:r>
+    </w:p>
+    <w:p>
+      <w:pPr>
+        <w:pStyle w:val="ListBullet"/>
+      </w:pPr>
+      <w:r>
+        <w:t>Väggarna är rymdstationspaneler med runda fönster mot rymden (stjärnor och en planet), skärmar med kurvor, ventiler, rör, skyltar ("AIRLOCK 3"), varningslampor och gul och svart varningsrand. Lampor, skärmar och fönster lyser i mörkret.</w:t>
+      </w:r>
+    </w:p>
+    <w:p>
+      <w:pPr>
+        <w:pStyle w:val="ListBullet"/>
+      </w:pPr>
+      <w:r>
+        <w:t>Golvet är mörka plåtar med svagt lysande skarvar. Himlen är en nebulosa med en ringad planet och en liten måne. Små glödande stoftkorn svävar i luften.</w:t>
+      </w:r>
+    </w:p>
+    <w:p>
+      <w:pPr>
+        <w:pStyle w:val="ListBullet"/>
+      </w:pPr>
+      <w:r>
+        <w:t>I rymdstationen har figuren en rymdhjälm: ett glasklot med glans, en krage med orange kant, en antenn med röd lampa och en syretank med slang på ryggen. Hjälmen anpassas efter figuren så att även öronen på katten och hästen ryms.</w:t>
       </w:r>
     </w:p>
     <w:p>

</xml_diff>

<commit_message>
Banor som data med automatiska tester, introduktionsbanor och lämna-knapp
Banor byggs och testas av tools/build-levels.mjs och läses från levels.json.
Åtta handbyggda introduktionsbanor med förklaringar och guidade pilar.
Lämna banan under spelet kostar ett liv (inte i introduktionen). Specen v1.4.

Co-Authored-By: Claude Sonnet 5.5 <noreply@anthropic.com>
Claude-Session: https://claude.ai/code/session_01P9bR1QdvvjTKHNj3Z4CUgp
</commit_message>
<xml_diff>
--- a/docs/Maze-Memory-spec.docx
+++ b/docs/Maze-Memory-spec.docx
@@ -28,7 +28,7 @@
         <w:t xml:space="preserve">Version: </w:t>
       </w:r>
       <w:r>
-        <w:t>1.3 – Snyggare rymdstation med rymdhjälm</w:t>
+        <w:t>1.4 – Banor som data, automatiska tester, introduktion</w:t>
         <w:br/>
       </w:r>
       <w:r>
@@ -725,6 +725,94 @@
       </w:pPr>
       <w:r>
         <w:t>Natt är ett väder och väljs per bana som de andra vädren. Det förekommer inte i inomhusteman.</w:t>
+      </w:r>
+    </w:p>
+    <w:p>
+      <w:pPr>
+        <w:pStyle w:val="Heading1"/>
+      </w:pPr>
+      <w:r>
+        <w:t>5k. Introduktionsbanor</w:t>
+      </w:r>
+    </w:p>
+    <w:p>
+      <w:pPr>
+        <w:pStyle w:val="ListBullet"/>
+      </w:pPr>
+      <w:r>
+        <w:t>Åtta handbyggda introduktionsbanor ligger längst ned på bankartan (markerade med en examenshatt). De är små och lär ut ett moment i taget: 1. Kartan (titta på den rosa linjen, landmärken, "Jag är redo"), 2. Vägval (pilarna är sett från figurens håll), 3. Återvändsgränd (och Vänd-knappen), 4. Kompassen, 5. Hitta vägen själv utan rosa linje, 6. Tiden, 7. Monster (röd kant och backspegel) och 8. Gömställen.</w:t>
+      </w:r>
+    </w:p>
+    <w:p>
+      <w:pPr>
+        <w:pStyle w:val="ListBullet"/>
+      </w:pPr>
+      <w:r>
+        <w:t>Förklaringarna visas som rutor med text som pausar spelet. Den del av skärmen som förklaras markeras med en blinkande gul ram. I korsningar visar blinkande pilar och en liten text vilken väg man ska ta, och de andra pilarna är låsta så att man inte kan fastna.</w:t>
+      </w:r>
+    </w:p>
+    <w:p>
+      <w:pPr>
+        <w:pStyle w:val="ListBullet"/>
+      </w:pPr>
+      <w:r>
+        <w:t>Introduktionen kostar inga liv: tar tiden slut eller hinner monstret ikapp får man bara försöka igen. Nya spelare börjar på introduktion 1.</w:t>
+      </w:r>
+    </w:p>
+    <w:p>
+      <w:pPr>
+        <w:pStyle w:val="ListBullet"/>
+      </w:pPr>
+      <w:r>
+        <w:t>Man kan lämna en bana mitt under spelet med ✕-knappen uppe till vänster. Den frågar först och kostar ett liv (inte i introduktionen). I kartvyn finns som förut en tillbakapil som inte kostar något.</w:t>
+      </w:r>
+    </w:p>
+    <w:p>
+      <w:pPr>
+        <w:pStyle w:val="Heading1"/>
+      </w:pPr>
+      <w:r>
+        <w:t>5l. Banor som data och automatiska tester</w:t>
+      </w:r>
+    </w:p>
+    <w:p>
+      <w:pPr>
+        <w:pStyle w:val="ListBullet"/>
+      </w:pPr>
+      <w:r>
+        <w:t>Banorna är data (web/levels/levels.json), inte kod. Varje bana beskriver labyrint, start, mål, tema, väder, landmärken, gömställen och tidsgräns eller monsterfart. Spelet läser filen och kan fortfarande generera banor om den saknas.</w:t>
+      </w:r>
+    </w:p>
+    <w:p>
+      <w:pPr>
+        <w:pStyle w:val="ListBullet"/>
+      </w:pPr>
+      <w:r>
+        <w:t>Banorna byggs i förväg av ett verktyg (node tools/build-levels.mjs). Det skriver också en rapport (web/levels/report.txt) med en rad per bana.</w:t>
+      </w:r>
+    </w:p>
+    <w:p>
+      <w:pPr>
+        <w:pStyle w:val="ListBullet"/>
+      </w:pPr>
+      <w:r>
+        <w:t>Automatiska tester: banan går att lösa, alla celler går att nå, inga öppna 2x2-ytor, tidsgränsen och monstret går att klara för en spelare som kan vägen, landmärken krockar inte med gömställen, inget landmärke upprepas och ingen bana är en kopia. En bana som inte klarar testerna byts ut mot en ny.</w:t>
+      </w:r>
+    </w:p>
+    <w:p>
+      <w:pPr>
+        <w:pStyle w:val="ListBullet"/>
+      </w:pPr>
+      <w:r>
+        <w:t>Svårighetsbetyg 0–100 beräknas från rätt vägs längd, antal korsningar och val, sidogångar, loopar och hur snäv tid eller monster är. Betyget styr om banan visas som Lätt, Medel eller Svår på bankartan.</w:t>
+      </w:r>
+    </w:p>
+    <w:p>
+      <w:pPr>
+        <w:pStyle w:val="ListBullet"/>
+      </w:pPr>
+      <w:r>
+        <w:t>Det finns 100 vanliga banor och 8 introduktionsbanor.</w:t>
       </w:r>
     </w:p>
     <w:p>

</xml_diff>

<commit_message>
Gömställen som fungerar: monstret ger upp och somnar
Gömd är man trygg. Monstret letar aldrig nära tunnan och går sedan tillbaka till
starten och somnar. Knappen låses när monstret ser en. Introduktion 8 går att klara.
Specen v1.5.

Co-Authored-By: Claude Sonnet 5.5 <noreply@anthropic.com>
Claude-Session: https://claude.ai/code/session_01P9bR1QdvvjTKHNj3Z4CUgp
</commit_message>
<xml_diff>
--- a/docs/Maze-Memory-spec.docx
+++ b/docs/Maze-Memory-spec.docx
@@ -28,7 +28,7 @@
         <w:t xml:space="preserve">Version: </w:t>
       </w:r>
       <w:r>
-        <w:t>1.4 – Banor som data, automatiska tester, introduktion</w:t>
+        <w:t>1.5 – Gömställen som fungerar</w:t>
         <w:br/>
       </w:r>
       <w:r>
@@ -476,7 +476,7 @@
         <w:pStyle w:val="ListBullet"/>
       </w:pPr>
       <w:r>
-        <w:t>Vid en tunna visas knappen Göm dig. Om monstret är längre bort än 3 rutor tappar det bort spelaren och går och letar i 6–10 sekunder, beroende på svårighet. Är det närmare ser det spelaren och kommer ändå.</w:t>
+        <w:t>Vid en tunna visas knappen Göm dig. Är monstret närmare än cirka 3–4 rutor ser det spelaren gömma sig, och knappen är då låst med texten "För sent, monstret ser dig!". Annars tappar monstret bort spelaren.</w:t>
       </w:r>
     </w:p>
     <w:p>
@@ -484,7 +484,23 @@
         <w:pStyle w:val="ListBullet"/>
       </w:pPr>
       <w:r>
-        <w:t>Spelaren kan komma fram när som helst. Om monstret hunnit sluta leta är det på väg igen.</w:t>
+        <w:t>Gömd är spelaren trygg. Monstret letar i 6–10 sekunder (beroende på tempo): det går till korsningar i närheten, stannar och tittar sig omkring och kikar in i andra tunnor, men aldrig nära spelarens tunna. Det hittar aldrig en gömd spelare.</w:t>
+      </w:r>
+    </w:p>
+    <w:p>
+      <w:pPr>
+        <w:pStyle w:val="ListBullet"/>
+      </w:pPr>
+      <w:r>
+        <w:t>Sedan ger monstret upp: det går tillbaka till starten och somnar, och väcks igen efter några sekunder. Spelaren får alltså ett nytt försprång och monstret hamnar bakom, inte på vägen mot målet. En text berättar att monstret har gett upp.</w:t>
+      </w:r>
+    </w:p>
+    <w:p>
+      <w:pPr>
+        <w:pStyle w:val="ListBullet"/>
+      </w:pPr>
+      <w:r>
+        <w:t>Kommer spelaren fram medan monstret fortfarande letar och är närmare än 6 rutor ser det spelaren och jagar igen. Vänta tills det har gett upp.</w:t>
       </w:r>
     </w:p>
     <w:p>

</xml_diff>

<commit_message>
Två introduktionsbanor: en för det vanliga och en för monster och gömställen
Co-Authored-By: Claude Sonnet 5.5 <noreply@anthropic.com>
Claude-Session: https://claude.ai/code/session_01P9bR1QdvvjTKHNj3Z4CUgp
</commit_message>
<xml_diff>
--- a/docs/Maze-Memory-spec.docx
+++ b/docs/Maze-Memory-spec.docx
@@ -28,7 +28,7 @@
         <w:t xml:space="preserve">Version: </w:t>
       </w:r>
       <w:r>
-        <w:t>1.5 – Gömställen som fungerar</w:t>
+        <w:t>1.6 – Två introduktionsbanor, titta runt i tunnan, zooma kartan</w:t>
         <w:br/>
       </w:r>
       <w:r>
@@ -756,15 +756,7 @@
         <w:pStyle w:val="ListBullet"/>
       </w:pPr>
       <w:r>
-        <w:t>Åtta handbyggda introduktionsbanor ligger längst ned på bankartan (markerade med en examenshatt). De är små och lär ut ett moment i taget: 1. Kartan (titta på den rosa linjen, landmärken, "Jag är redo"), 2. Vägval (pilarna är sett från figurens håll), 3. Återvändsgränd (och Vänd-knappen), 4. Kompassen, 5. Hitta vägen själv utan rosa linje, 6. Tiden, 7. Monster (röd kant och backspegel) och 8. Gömställen.</w:t>
-      </w:r>
-    </w:p>
-    <w:p>
-      <w:pPr>
-        <w:pStyle w:val="ListBullet"/>
-      </w:pPr>
-      <w:r>
-        <w:t>Förklaringarna visas som rutor med text som pausar spelet. Den del av skärmen som förklaras markeras med en blinkande gul ram. I korsningar visar blinkande pilar och en liten text vilken väg man ska ta, och de andra pilarna är låsta så att man inte kan fastna.</w:t>
+        <w:t>Två handbyggda introduktionsbanor ligger längst ned på bankartan (markerade med en examenshatt). 1. Så spelar du: en vanlig bana som lär ut kartan med rosa linje och landmärken, att nypa för att zooma, pilarna (sett från figurens håll), återvändsgränd och Vänd-knappen, kompassen, att den rosa linjen ofta är borta i vanliga banor och tidsstapeln. 2. Monster: monstret som vaknar och jagar, röd skärmkant och backspegel, samt hur man gömmer sig i tunnan, svajpar för att titta runt och väntar tills monstret gett upp.</w:t>
       </w:r>
     </w:p>
     <w:p>
@@ -828,7 +820,7 @@
         <w:pStyle w:val="ListBullet"/>
       </w:pPr>
       <w:r>
-        <w:t>Det finns 100 vanliga banor och 8 introduktionsbanor.</w:t>
+        <w:t>Det finns 100 vanliga banor och 2 introduktionsbanor.</w:t>
       </w:r>
     </w:p>
     <w:p>

</xml_diff>

<commit_message>
Kikar (karta under spelet) och tre expeditioner med checkpoints
Co-Authored-By: Claude Sonnet 5.5 <noreply@anthropic.com>
Claude-Session: https://claude.ai/code/session_01P9bR1QdvvjTKHNj3Z4CUgp
</commit_message>
<xml_diff>
--- a/docs/Maze-Memory-spec.docx
+++ b/docs/Maze-Memory-spec.docx
@@ -773,6 +773,70 @@
       </w:pPr>
       <w:r>
         <w:t>Man kan lämna en bana mitt under spelet med ✕-knappen uppe till vänster. Den frågar först och kostar ett liv (inte i introduktionen). I kartvyn finns som förut en tillbakapil som inte kostar något.</w:t>
+      </w:r>
+    </w:p>
+    <w:p>
+      <w:pPr>
+        <w:pStyle w:val="Heading1"/>
+      </w:pPr>
+      <w:r>
+        <w:t>5m. Kikar (kartan under spelet)</w:t>
+      </w:r>
+    </w:p>
+    <w:p>
+      <w:pPr>
+        <w:pStyle w:val="ListBullet"/>
+      </w:pPr>
+      <w:r>
+        <w:t>Kikar är en begränsad hjälp. Från början har man inga. När man har klarat tre svåra banor introduceras de och man får fem gratis.</w:t>
+      </w:r>
+    </w:p>
+    <w:p>
+      <w:pPr>
+        <w:pStyle w:val="ListBullet"/>
+      </w:pPr>
+      <w:r>
+        <w:t>Man tjänar en ny kik för var tredje bana man klarar för första gången. Man kan också köpa fem för 9 kr (priset ska balanseras mot Apples avgifter; i prototypen debiteras ingenting).</w:t>
+      </w:r>
+    </w:p>
+    <w:p>
+      <w:pPr>
+        <w:pStyle w:val="ListBullet"/>
+      </w:pPr>
+      <w:r>
+        <w:t>När figuren står still trycker man på kompassen för att se hela kartan med en pil och nål som visar var man är. Kartan visar inte den rosa vägen och inte monstret. Tiden och monstret fortsätter medan kartan är uppe. Kartan går att vicka, zooma och dra och stängs med "Stäng kartan". Kikar finns inte i introduktionsbanorna.</w:t>
+      </w:r>
+    </w:p>
+    <w:p>
+      <w:pPr>
+        <w:pStyle w:val="ListBullet"/>
+      </w:pPr>
+      <w:r>
+        <w:t>Antalet kvarvarande kikar visas som en liten ögonbricka vid kompassen.</w:t>
+      </w:r>
+    </w:p>
+    <w:p>
+      <w:pPr>
+        <w:pStyle w:val="Heading1"/>
+      </w:pPr>
+      <w:r>
+        <w:t>5n. Expeditioner</w:t>
+      </w:r>
+    </w:p>
+    <w:p>
+      <w:pPr>
+        <w:pStyle w:val="ListBullet"/>
+      </w:pPr>
+      <w:r>
+        <w:t>En expedition är en lång färd i flera delar med checkpoints. Varje del är en egen labyrint. När man når en checkpoint visas nästa del av kartan att studera, och tid och felval följer med. Misslyckas man börjar man om från första delen.</w:t>
+      </w:r>
+    </w:p>
+    <w:p>
+      <w:pPr>
+        <w:pStyle w:val="ListBullet"/>
+      </w:pPr>
+      <w:r>
+        <w:t>Det finns tre expeditioner på bankartan (kompassikon, orange): Expedition 1 (medel, 3 delar à 12×13, ingen tidsgräns), Expedition 2 (svår, 4 delar à 16×17, gemensam tidsgräns) och Expedition 3 (extra svår, 5 delar à 22×23, ett monster jagar i varje del). De ligger efter bana 20, 50 och 80.</w:t>
       </w:r>
     </w:p>
     <w:p>

</xml_diff>

<commit_message>
Klockbanor: långa banor med för kort tid, klockor i sidogångar ger extra tid, alla klockor ger en kik
Co-Authored-By: Claude Sonnet 5.5 <noreply@anthropic.com>
Claude-Session: https://claude.ai/code/session_01P9bR1QdvvjTKHNj3Z4CUgp
</commit_message>
<xml_diff>
--- a/docs/Maze-Memory-spec.docx
+++ b/docs/Maze-Memory-spec.docx
@@ -837,6 +837,38 @@
       </w:pPr>
       <w:r>
         <w:t>Det finns tre expeditioner på bankartan (kompassikon, orange): Expedition 1 (medel, 3 delar à 12×13, ingen tidsgräns), Expedition 2 (svår, 4 delar à 16×17, gemensam tidsgräns) och Expedition 3 (extra svår, 5 delar à 22×23, ett monster jagar i varje del). De ligger efter bana 20, 50 och 80.</w:t>
+      </w:r>
+    </w:p>
+    <w:p>
+      <w:pPr>
+        <w:pStyle w:val="Heading1"/>
+      </w:pPr>
+      <w:r>
+        <w:t>5o. Klockbanor</w:t>
+      </w:r>
+    </w:p>
+    <w:p>
+      <w:pPr>
+        <w:pStyle w:val="ListBullet"/>
+      </w:pPr>
+      <w:r>
+        <w:t>Klockbanor är långa banor där tiden från början är för kort (80 % av tiden som behövs för att springa rätt väg utan att tveka). Längs vägen, i sidogångar, ligger klockor ⏰ som ger extra tid (cirka 45 % av den perfekta tiden per klocka, mer på lugnt tempo och mindre på snabbt).</w:t>
+      </w:r>
+    </w:p>
+    <w:p>
+      <w:pPr>
+        <w:pStyle w:val="ListBullet"/>
+      </w:pPr>
+      <w:r>
+        <w:t>Det ska gå att klara banan med en eller två klockor. Tar man alla klockor får man en bonus: en kik. Klockorna syns på kartan så att man kan planera, och antalet visas i övre kanten (⏰ 1/4). När man tar en klocka visas "+15 s".</w:t>
+      </w:r>
+    </w:p>
+    <w:p>
+      <w:pPr>
+        <w:pStyle w:val="ListBullet"/>
+      </w:pPr>
+      <w:r>
+        <w:t>Det finns tre klockbanor (turkos nod med ⏰) efter bana 35, 65 och 92. Byggverktyget testar att tiden är för kort utan klockor men räcker med en klocka.</w:t>
       </w:r>
     </w:p>
     <w:p>

</xml_diff>

<commit_message>
Ljud och musik (Web Audio), testversion med feedback, hemskärmsikon och testguide
Co-Authored-By: Claude Sonnet 5.5 <noreply@anthropic.com>
Claude-Session: https://claude.ai/code/session_01P9bR1QdvvjTKHNj3Z4CUgp
</commit_message>
<xml_diff>
--- a/docs/Maze-Memory-spec.docx
+++ b/docs/Maze-Memory-spec.docx
@@ -869,6 +869,38 @@
       </w:pPr>
       <w:r>
         <w:t>Det finns tre klockbanor (turkos nod med ⏰) efter bana 35, 65 och 92. Byggverktyget testar att tiden är för kort utan klockor men räcker med en klocka.</w:t>
+      </w:r>
+    </w:p>
+    <w:p>
+      <w:pPr>
+        <w:pStyle w:val="Heading1"/>
+      </w:pPr>
+      <w:r>
+        <w:t>5p. Ljud och testversion</w:t>
+      </w:r>
+    </w:p>
+    <w:p>
+      <w:pPr>
+        <w:pStyle w:val="ListBullet"/>
+      </w:pPr>
+      <w:r>
+        <w:t>Ljud och musik skapas med Web Audio i koden, utan ljudfiler: steg, tryck, vägval, fel väg, klocka, checkpoint, seger, förlust, monsterrop, hjärtslag när monstret är nära, tunnan, kikaren och en tickning när tiden nästan är slut. Musiken är lugn i menyn och vid studier, livligare under spelet och spänd när monstret jagar. Ljudeffekter och musik kan stängas av var för sig under kugghjulet.</w:t>
+      </w:r>
+    </w:p>
+    <w:p>
+      <w:pPr>
+        <w:pStyle w:val="ListBullet"/>
+      </w:pPr>
+      <w:r>
+        <w:t>Testversionen publiceras på GitHub Pages och kan läggas till på hemskärmen (manifest och ikoner finns). I menyn finns "Tyck till": testaren skriver feedback och information om telefon, inställningar och de 15 senaste banorna följer med. Feedbacken delas via telefonens delningsmeny, eller öppnar ett formulär om en formulärlänk läggs in i web/src/config.js.</w:t>
+      </w:r>
+    </w:p>
+    <w:p>
+      <w:pPr>
+        <w:pStyle w:val="ListBullet"/>
+      </w:pPr>
+      <w:r>
+        <w:t>En testguide för de som ska testa finns i docs/Maze-Memory-testguide.docx.</w:t>
       </w:r>
     </w:p>
     <w:p>

</xml_diff>

<commit_message>
Progression (klara en bana för att öppna nästa, kan stängas av i testinställningar) och tre kikar per bana
Co-Authored-By: Claude Sonnet 5.5 <noreply@anthropic.com>
Claude-Session: https://claude.ai/code/session_01P9bR1QdvvjTKHNj3Z4CUgp
</commit_message>
<xml_diff>
--- a/docs/Maze-Memory-spec.docx
+++ b/docs/Maze-Memory-spec.docx
@@ -788,7 +788,7 @@
         <w:pStyle w:val="ListBullet"/>
       </w:pPr>
       <w:r>
-        <w:t>Kikar är en begränsad hjälp. Från början har man inga. När man har klarat tre svåra banor introduceras de och man får fem gratis.</w:t>
+        <w:t>Kikar är en begränsad hjälp: tre per bana (gäller inte introduktionsbanorna). Räknaren visas som en liten ögonbricka vid kompassen. I en expedition delas de tre på alla delar. Den som tar alla klockor i en klockbana får en extra kik direkt.</w:t>
       </w:r>
     </w:p>
     <w:p>
@@ -796,7 +796,7 @@
         <w:pStyle w:val="ListBullet"/>
       </w:pPr>
       <w:r>
-        <w:t>Man tjänar en ny kik för var tredje bana man klarar för första gången. Man kan också köpa fem för 9 kr (priset ska balanseras mot Apples avgifter; i prototypen debiteras ingenting).</w:t>
+        <w:t>När figuren står still trycker man på kompassen för att se hela kartan med en pil och nål som visar var man är. Kartan visar inte den rosa vägen och inte monstret. Tiden och monstret fortsätter medan kartan är uppe. Kartan går att vicka, zooma och dra och stängs med "Stäng kartan".</w:t>
       </w:r>
     </w:p>
     <w:p>
@@ -804,15 +804,39 @@
         <w:pStyle w:val="ListBullet"/>
       </w:pPr>
       <w:r>
-        <w:t>När figuren står still trycker man på kompassen för att se hela kartan med en pil och nål som visar var man är. Kartan visar inte den rosa vägen och inte monstret. Tiden och monstret fortsätter medan kartan är uppe. Kartan går att vicka, zooma och dra och stängs med "Stäng kartan". Kikar finns inte i introduktionsbanorna.</w:t>
+        <w:t>Senare kan kikar bli något som tjänas in eller köps (tidigare idé: 5 gratis efter några svåra banor, sedan 1 per tredje bana eller 5 för 9 kr). Det är avstängt just nu.</w:t>
       </w:r>
     </w:p>
     <w:p>
       <w:pPr>
+        <w:pStyle w:val="Heading1"/>
+      </w:pPr>
+      <w:r>
+        <w:t>5q. Progression</w:t>
+      </w:r>
+    </w:p>
+    <w:p>
+      <w:pPr>
         <w:pStyle w:val="ListBullet"/>
       </w:pPr>
       <w:r>
-        <w:t>Antalet kvarvarande kikar visas som en liten ögonbricka vid kompassen.</w:t>
+        <w:t>Man måste klara en bana för att kunna spela nästa. Huvudspåret är de två introduktionsbanorna följda av bana 1–100 i ordning. Låsta banor är grå med ett hänglås och en ruta berättar vad man behöver klara.</w:t>
+      </w:r>
+    </w:p>
+    <w:p>
+      <w:pPr>
+        <w:pStyle w:val="ListBullet"/>
+      </w:pPr>
+      <w:r>
+        <w:t>Expeditioner och klockbanor är frivilliga sidobanor. De öppnas när banan de ligger efter är klarad, men stoppar inte huvudspåret.</w:t>
+      </w:r>
+    </w:p>
+    <w:p>
+      <w:pPr>
+        <w:pStyle w:val="ListBullet"/>
+      </w:pPr>
+      <w:r>
+        <w:t>Äldre sparfiler fungerar: har man klarat en senare bana är de före den öppna. I testinställningarna finns "Lås upp alla banor" som stänger av progressionen.</w:t>
       </w:r>
     </w:p>
     <w:p>

</xml_diff>

<commit_message>
Kapitel om fem banor med tre liv, hoppa över banor (tre gratis), kikar förklaras i intro, mer klassisk musik
Co-Authored-By: Claude Sonnet 5.5 <noreply@anthropic.com>
Claude-Session: https://claude.ai/code/session_01P9bR1QdvvjTKHNj3Z4CUgp
</commit_message>
<xml_diff>
--- a/docs/Maze-Memory-spec.docx
+++ b/docs/Maze-Memory-spec.docx
@@ -788,7 +788,7 @@
         <w:pStyle w:val="ListBullet"/>
       </w:pPr>
       <w:r>
-        <w:t>Kikar är en begränsad hjälp: tre per bana (gäller inte introduktionsbanorna). Räknaren visas som en liten ögonbricka vid kompassen. I en expedition delas de tre på alla delar. Den som tar alla klockor i en klockbana får en extra kik direkt.</w:t>
+        <w:t>Kikar är en begränsad hjälp: tre per bana (även i introduktionen, där de också förklaras). Räknaren visas som en liten ögonbricka vid kompassen. I en expedition delas de tre på alla delar. Den som tar alla klockor i en klockbana får en extra kik direkt.</w:t>
       </w:r>
     </w:p>
     <w:p>
@@ -812,7 +812,7 @@
         <w:pStyle w:val="Heading1"/>
       </w:pPr>
       <w:r>
-        <w:t>5q. Progression</w:t>
+        <w:t>5q. Progression, kapitel och liv</w:t>
       </w:r>
     </w:p>
     <w:p>
@@ -820,7 +820,7 @@
         <w:pStyle w:val="ListBullet"/>
       </w:pPr>
       <w:r>
-        <w:t>Man måste klara en bana för att kunna spela nästa. Huvudspåret är de två introduktionsbanorna följda av bana 1–100 i ordning. Låsta banor är grå med ett hänglås och en ruta berättar vad man behöver klara.</w:t>
+        <w:t>Banorna är indelade i kapitel om fem banor (bana 1–5 är kapitel 1, osv). Introduktionen kommer först. Man måste klara en bana för att kunna spela nästa, och ett kapitel måste vara klart för att nästa ska öppnas. Låsta banor är grå med ett hänglås, och en ruta berättar vad man behöver klara.</w:t>
       </w:r>
     </w:p>
     <w:p>
@@ -828,7 +828,7 @@
         <w:pStyle w:val="ListBullet"/>
       </w:pPr>
       <w:r>
-        <w:t>Expeditioner och klockbanor är frivilliga sidobanor. De öppnas när banan de ligger efter är klarad, men stoppar inte huvudspåret.</w:t>
+        <w:t>Man har tre liv per kapitel. Ett liv förloras när man misslyckas med (eller lämnar) den bana man just nu ska klara. Är liven slut börjar kapitlet om från första banan med tre nya liv, men stjärnor och klarade banor ligger kvar. Att spela om en redan klarad bana, en introduktionsbana eller en bonusbana kostar inget liv. Klarar man ett kapitel räknas det som klart och är alltid spelbart.</w:t>
       </w:r>
     </w:p>
     <w:p>
@@ -836,7 +836,31 @@
         <w:pStyle w:val="ListBullet"/>
       </w:pPr>
       <w:r>
-        <w:t>Äldre sparfiler fungerar: har man klarat en senare bana är de före den öppna. I testinställningarna finns "Lås upp alla banor" som stänger av progressionen.</w:t>
+        <w:t>Expeditioner och klockbanor är frivilliga bonusbanor (inga liv). De öppnas när banan de ligger efter är klarad, men stoppar inte huvudspåret.</w:t>
+      </w:r>
+    </w:p>
+    <w:p>
+      <w:pPr>
+        <w:pStyle w:val="ListBullet"/>
+      </w:pPr>
+      <w:r>
+        <w:t>Äldre sparfiler fungerar: är banor klarade räknas kapitlen ut från dem. I testinställningarna finns "Lås upp alla banor" som stänger av progressionen.</w:t>
+      </w:r>
+    </w:p>
+    <w:p>
+      <w:pPr>
+        <w:pStyle w:val="Heading1"/>
+      </w:pPr>
+      <w:r>
+        <w:t>5r. Hoppa över banor</w:t>
+      </w:r>
+    </w:p>
+    <w:p>
+      <w:pPr>
+        <w:pStyle w:val="ListBullet"/>
+      </w:pPr>
+      <w:r>
+        <w:t>Man får tre hopp gratis från början. Efter att ha misslyckats med en bana minst två gånger visas knappen "Hoppa över banan". Banan räknas då som klar utan stjärnor (och kan spelas senare för stjärnor) och man går vidare i kapitlet. Är hoppen slut kan fler köpas (5 för 9 kr i den planerade versionen; i testversionen debiteras ingenting). På så sätt kan man hoppa över allt till slut.</w:t>
       </w:r>
     </w:p>
     <w:p>
@@ -908,7 +932,7 @@
         <w:pStyle w:val="ListBullet"/>
       </w:pPr>
       <w:r>
-        <w:t>Ljud och musik skapas med Web Audio i koden, utan ljudfiler: steg, tryck, vägval, fel väg, klocka, checkpoint, seger, förlust, monsterrop, hjärtslag när monstret är nära, tunnan, kikaren och en tickning när tiden nästan är slut. Musiken är lugn i menyn och vid studier, livligare under spelet och spänd när monstret jagar. Ljudeffekter och musik kan stängas av var för sig under kugghjulet.</w:t>
+        <w:t>Ljud och musik skapas med Web Audio i koden, utan ljudfiler: steg, tryck, vägval, fel väg, klocka, checkpoint, seger, förlust, monsterrop, hjärtslag när monstret är nära, tunnan, kikaren och en tickning när tiden nästan är slut. Musiken är små komponerade stycken i äventyrsstil: harpa, flöjt, pizzicato, stråkar och puka. Den är lugn i menyn och vid studier, livligare under spelet och spänd (moll, ostinato) när monstret jagar. Ljudeffekter och musik kan stängas av var för sig under kugghjulet.</w:t>
       </w:r>
     </w:p>
     <w:p>

</xml_diff>

<commit_message>
Monsterbanor och monsterintro borttagna; gulligare bankarta med moln, blommor, skyltar och vinkande figurer
Co-Authored-By: Claude Sonnet 5.5 <noreply@anthropic.com>
Claude-Session: https://claude.ai/code/session_01P9bR1QdvvjTKHNj3Z4CUgp
</commit_message>
<xml_diff>
--- a/docs/Maze-Memory-spec.docx
+++ b/docs/Maze-Memory-spec.docx
@@ -756,7 +756,7 @@
         <w:pStyle w:val="ListBullet"/>
       </w:pPr>
       <w:r>
-        <w:t>Två handbyggda introduktionsbanor ligger längst ned på bankartan (markerade med en examenshatt). 1. Så spelar du: en vanlig bana som lär ut kartan med rosa linje och landmärken, att nypa för att zooma, pilarna (sett från figurens håll), återvändsgränd och Vänd-knappen, kompassen, att den rosa linjen ofta är borta i vanliga banor och tidsstapeln. 2. Monster: monstret som vaknar och jagar, röd skärmkant och backspegel, samt hur man gömmer sig i tunnan, svajpar för att titta runt och väntar tills monstret gett upp.</w:t>
+        <w:t>Det finns en handbyggd introduktionsbana längst ned på bankartan (markerad med en examenshatt). Den är liten och guidad: kartan med rosa linje och landmärken, att nypa för att zooma och dra för att vicka, pilarna (sett från figurens håll) med en blinkande pil i varje korsning, kompassen och kikarna, återvändsgränd och Vänd-knappen samt tidsstapeln.</w:t>
       </w:r>
     </w:p>
     <w:p>
@@ -764,15 +764,7 @@
         <w:pStyle w:val="ListBullet"/>
       </w:pPr>
       <w:r>
-        <w:t>Introduktionen kostar inga liv: tar tiden slut eller hinner monstret ikapp får man bara försöka igen. Nya spelare börjar på introduktion 1.</w:t>
-      </w:r>
-    </w:p>
-    <w:p>
-      <w:pPr>
-        <w:pStyle w:val="ListBullet"/>
-      </w:pPr>
-      <w:r>
-        <w:t>Man kan lämna en bana mitt under spelet med ✕-knappen uppe till vänster. Den frågar först och kostar ett liv (inte i introduktionen). I kartvyn finns som förut en tillbakapil som inte kostar något.</w:t>
+        <w:t>Introduktionen kostar inga liv. Nya spelare börjar på introduktionen. Man kan lämna en bana mitt under spelet med ✕-knappen uppe till vänster (kostar ett liv om det är kapitlets aktuella bana). I kartvyn finns en tillbakapil som inte kostar något.</w:t>
       </w:r>
     </w:p>
     <w:p>
@@ -884,7 +876,7 @@
         <w:pStyle w:val="ListBullet"/>
       </w:pPr>
       <w:r>
-        <w:t>Det finns tre expeditioner på bankartan (kompassikon, orange): Expedition 1 (medel, 3 delar à 12×13, ingen tidsgräns), Expedition 2 (svår, 4 delar à 16×17, gemensam tidsgräns) och Expedition 3 (extra svår, 5 delar à 22×23, ett monster jagar i varje del). De ligger efter bana 20, 50 och 80.</w:t>
+        <w:t>Det finns tre expeditioner på bankartan (kompassikon, orange): Expedition 1 (medel, 3 delar à 12×13, ingen tidsgräns), Expedition 2 (svår, 4 delar à 16×17, gemensam tidsgräns) och Expedition 3 (extra svår, 5 delar à 22×23, gemensam tidsgräns). De ligger efter bana 20, 50 och 80.</w:t>
       </w:r>
     </w:p>
     <w:p>
@@ -956,6 +948,22 @@
         <w:pStyle w:val="Heading1"/>
       </w:pPr>
       <w:r>
+        <w:t>5s. Borttaget: monsterbanor</w:t>
+      </w:r>
+    </w:p>
+    <w:p>
+      <w:pPr>
+        <w:pStyle w:val="ListBullet"/>
+      </w:pPr>
+      <w:r>
+        <w:t>Monsterbanorna, gömställena (tunnorna) och monsterintrot är borttagna ur spelet eftersom de var för komplicerade för äldre spelare. Alla banor har nu tidsgräns (eller ingen gräns i Expedition 1). Koden för monster finns kvar men används inte, och kan tas fram igen som ett tillval om vi vill det senare.</w:t>
+      </w:r>
+    </w:p>
+    <w:p>
+      <w:pPr>
+        <w:pStyle w:val="Heading1"/>
+      </w:pPr>
+      <w:r>
         <w:t>5l. Banor som data och automatiska tester</w:t>
       </w:r>
     </w:p>
@@ -996,7 +1004,7 @@
         <w:pStyle w:val="ListBullet"/>
       </w:pPr>
       <w:r>
-        <w:t>Det finns 100 vanliga banor och 2 introduktionsbanor.</w:t>
+        <w:t>Det finns 100 vanliga banor och 1 introduktionsbana.</w:t>
       </w:r>
     </w:p>
     <w:p>

</xml_diff>

<commit_message>
Akvarietema med fiskar i luften, start med ryggen mot ingången, banor där håll-höger inte räcker, vimplar mellan kapitel
Co-Authored-By: Claude Sonnet 5.5 <noreply@anthropic.com>
Claude-Session: https://claude.ai/code/session_01P9bR1QdvvjTKHNj3Z4CUgp
</commit_message>
<xml_diff>
--- a/docs/Maze-Memory-spec.docx
+++ b/docs/Maze-Memory-spec.docx
@@ -957,6 +957,46 @@
       </w:pPr>
       <w:r>
         <w:t>Monsterbanorna, gömställena (tunnorna) och monsterintrot är borttagna ur spelet eftersom de var för komplicerade för äldre spelare. Alla banor har nu tidsgräns (eller ingen gräns i Expedition 1). Koden för monster finns kvar men används inte, och kan tas fram igen som ett tillval om vi vill det senare.</w:t>
+      </w:r>
+    </w:p>
+    <w:p>
+      <w:pPr>
+        <w:pStyle w:val="Heading1"/>
+      </w:pPr>
+      <w:r>
+        <w:t>5t. Varierade vägar, start och akvarium</w:t>
+      </w:r>
+    </w:p>
+    <w:p>
+      <w:pPr>
+        <w:pStyle w:val="ListBullet"/>
+      </w:pPr>
+      <w:r>
+        <w:t>Figuren startar alltid med ryggen mot ingången (grinden vid nedre kanten) och blicken norrut. Start väljs bland nedre kantens rutor som är öppna norrut.</w:t>
+      </w:r>
+    </w:p>
+    <w:p>
+      <w:pPr>
+        <w:pStyle w:val="ListBullet"/>
+      </w:pPr>
+      <w:r>
+        <w:t>Banorna har alltid några loopar och målet väljs bland rutor som man inte når genom att alltid hålla höger eller vänster hand mot väggen. Därför räcker det inte att följa väggen. Byggverktyget testar det för varje bana och byter ut banor där det räcker, eller där vägen till målet är för kort.</w:t>
+      </w:r>
+    </w:p>
+    <w:p>
+      <w:pPr>
+        <w:pStyle w:val="ListBullet"/>
+      </w:pPr>
+      <w:r>
+        <w:t>Nytt tema: Akvarium. Väggarna är glasrutor med bubblor, sjögräs och små fiskar, golvet är färgglatt akvariegrus och himlen är vatten med ljusstrålar. Fiskar och en stor val simmar i luften framför figuren, ovanför häckarna. Temat kommer tillbaka var tolfte bana.</w:t>
+      </w:r>
+    </w:p>
+    <w:p>
+      <w:pPr>
+        <w:pStyle w:val="ListBullet"/>
+      </w:pPr>
+      <w:r>
+        <w:t>Mellan två kapitel på bankartan hänger en vimpelrad över gången.</w:t>
       </w:r>
     </w:p>
     <w:p>

</xml_diff>

<commit_message>
Monsterbanor som tillval i inställningarna (av som standard)
Co-Authored-By: Claude Sonnet 5.5 <noreply@anthropic.com>
Claude-Session: https://claude.ai/code/session_01P9bR1QdvvjTKHNj3Z4CUgp
</commit_message>
<xml_diff>
--- a/docs/Maze-Memory-spec.docx
+++ b/docs/Maze-Memory-spec.docx
@@ -948,7 +948,7 @@
         <w:pStyle w:val="Heading1"/>
       </w:pPr>
       <w:r>
-        <w:t>5s. Borttaget: monsterbanor</w:t>
+        <w:t>5s. Monsterbanor som tillval</w:t>
       </w:r>
     </w:p>
     <w:p>
@@ -956,47 +956,15 @@
         <w:pStyle w:val="ListBullet"/>
       </w:pPr>
       <w:r>
-        <w:t>Monsterbanorna, gömställena (tunnorna) och monsterintrot är borttagna ur spelet eftersom de var för komplicerade för äldre spelare. Alla banor har nu tidsgräns (eller ingen gräns i Expedition 1). Koden för monster finns kvar men används inte, och kan tas fram igen som ett tillval om vi vill det senare.</w:t>
+        <w:t>Monsterbanorna är inte med som standard eftersom de var för komplicerade för äldre spelare. Under Inställningar finns tillvalet "Monsterbanor (tillval)". När det är på blir ungefär 40 procent av de vanliga banorna (samma urval som förut) monsterbanor i stället för tidsbanor: ett monster väcks efter en stund och jagar, och man kan gömma sig i orangea tunnor. Banorna är desamma, bara spelsättet ändras. Monsterbanorna markeras med en lila nod och 👾 på kartan.</w:t>
       </w:r>
     </w:p>
     <w:p>
       <w:pPr>
-        <w:pStyle w:val="Heading1"/>
+        <w:pStyle w:val="ListBullet"/>
       </w:pPr>
       <w:r>
-        <w:t>5t. Varierade vägar, start och akvarium</w:t>
-      </w:r>
-    </w:p>
-    <w:p>
-      <w:pPr>
-        <w:pStyle w:val="ListBullet"/>
-      </w:pPr>
-      <w:r>
-        <w:t>Figuren startar alltid med ryggen mot ingången (grinden vid nedre kanten) och blicken norrut. Start väljs bland nedre kantens rutor som är öppna norrut.</w:t>
-      </w:r>
-    </w:p>
-    <w:p>
-      <w:pPr>
-        <w:pStyle w:val="ListBullet"/>
-      </w:pPr>
-      <w:r>
-        <w:t>Banorna har alltid några loopar och målet väljs bland rutor som man inte når genom att alltid hålla höger eller vänster hand mot väggen. Därför räcker det inte att följa väggen. Byggverktyget testar det för varje bana och byter ut banor där det räcker, eller där vägen till målet är för kort.</w:t>
-      </w:r>
-    </w:p>
-    <w:p>
-      <w:pPr>
-        <w:pStyle w:val="ListBullet"/>
-      </w:pPr>
-      <w:r>
-        <w:t>Nytt tema: Akvarium. Väggarna är glasrutor med bubblor, sjögräs och små fiskar, golvet är färgglatt akvariegrus och himlen är vatten med ljusstrålar. Fiskar och en stor val simmar i luften framför figuren, ovanför häckarna. Temat kommer tillbaka var tolfte bana.</w:t>
-      </w:r>
-    </w:p>
-    <w:p>
-      <w:pPr>
-        <w:pStyle w:val="ListBullet"/>
-      </w:pPr>
-      <w:r>
-        <w:t>Mellan två kapitel på bankartan hänger en vimpelrad över gången.</w:t>
+        <w:t>Första gången man spelar en monsterbana förklaras monstret, tunnorna och backspegeln i korta rutor. Monsterintrot som egen introduktionsbana är borttaget. Expeditioner och klockbanor påverkas inte av tillvalet.</w:t>
       </w:r>
     </w:p>
     <w:p>

</xml_diff>

<commit_message>
Discobanor med dubbla poäng: neonväggar, blinkande dansgolv, spegelkula, ljusstrålar och egen discolåt
Co-Authored-By: Claude Sonnet 5.5 <noreply@anthropic.com>
Claude-Session: https://claude.ai/code/session_01P9bR1QdvvjTKHNj3Z4CUgp
</commit_message>
<xml_diff>
--- a/docs/Maze-Memory-spec.docx
+++ b/docs/Maze-Memory-spec.docx
@@ -965,6 +965,38 @@
       </w:pPr>
       <w:r>
         <w:t>Första gången man spelar en monsterbana förklaras monstret, tunnorna och backspegeln i korta rutor. Monsterintrot som egen introduktionsbana är borttaget. Expeditioner och klockbanor påverkas inte av tillvalet.</w:t>
+      </w:r>
+    </w:p>
+    <w:p>
+      <w:pPr>
+        <w:pStyle w:val="Heading1"/>
+      </w:pPr>
+      <w:r>
+        <w:t>5u. Discobanor (dubbla poäng)</w:t>
+      </w:r>
+    </w:p>
+    <w:p>
+      <w:pPr>
+        <w:pStyle w:val="ListBullet"/>
+      </w:pPr>
+      <w:r>
+        <w:t>Det finns tre discobanor (lila nod med 🪩 och beteckningen D1–D3) efter bana 12, 44 och 77. De är frivilliga bonusbanor som inte kostar liv och som öppnas av banan de ligger efter. På en discobana får man dubbla stjärnor: 2–6 i stället för 1–3. Resultatet visar sex stjärnplatser och texten "dubbla poäng!". Stjärnorna räknas med i totalen (som låser upp figurer), och totalen räknar nu även bonusbanorna.</w:t>
+      </w:r>
+    </w:p>
+    <w:p>
+      <w:pPr>
+        <w:pStyle w:val="ListBullet"/>
+      </w:pPr>
+      <w:r>
+        <w:t>Utseende: mörka spegelväggar med neonlister som byter färg, ett dansgolv med färgade rutor som blinkar i takt (120 slag per minut), en snurrande spegelkula, färgade ljusstrålar som sveper över banan med ljuspölar på golvet och en natthimmel med ljusstrålar.</w:t>
+      </w:r>
+    </w:p>
+    <w:p>
+      <w:pPr>
+        <w:pStyle w:val="ListBullet"/>
+      </w:pPr>
+      <w:r>
+        <w:t>Musik: en egen discolåt med fyra-på-golvet-bas, hi-hat, handklapp, funkig basgång, ackordsslag och ett kort tema. Banorna byggs och testas på samma sätt som vanliga banor (håll höger räcker inte).</w:t>
       </w:r>
     </w:p>
     <w:p>

</xml_diff>

<commit_message>
Vänd medan figuren springer (utan felval)
Co-Authored-By: Claude Sonnet 5.5 <noreply@anthropic.com>
Claude-Session: https://claude.ai/code/session_01P9bR1QdvvjTKHNj3Z4CUgp
</commit_message>
<xml_diff>
--- a/docs/Maze-Memory-spec.docx
+++ b/docs/Maze-Memory-spec.docx
@@ -997,6 +997,30 @@
       </w:pPr>
       <w:r>
         <w:t>Musik: en egen discolåt med fyra-på-golvet-bas, hi-hat, handklapp, funkig basgång, ackordsslag och ett kort tema. Banorna byggs och testas på samma sätt som vanliga banor (håll höger räcker inte).</w:t>
+      </w:r>
+    </w:p>
+    <w:p>
+      <w:pPr>
+        <w:pStyle w:val="Heading1"/>
+      </w:pPr>
+      <w:r>
+        <w:t>5v. Vända medan figuren springer</w:t>
+      </w:r>
+    </w:p>
+    <w:p>
+      <w:pPr>
+        <w:pStyle w:val="ListBullet"/>
+      </w:pPr>
+      <w:r>
+        <w:t>Medan figuren springer är pilarna låsta, men "Vänd" är tillgänglig. Trycker man på den springer figuren tillbaka längs samma väg till korsningen den kom från, utan att det räknas som ett felval. Det går att vända en gång per löpning, så att man inte råkar vända fram och tillbaka. Tiden går som vanligt. Kameran vrider sig med den snabba vändningen.</w:t>
+      </w:r>
+    </w:p>
+    <w:p>
+      <w:pPr>
+        <w:pStyle w:val="ListBullet"/>
+      </w:pPr>
+      <w:r>
+        <w:t>Tillägg i menyn: knappen "Hoppa över introduktionen" (även som andra knapp i introduktionens förklaringsrutor) och att ett tryck på en bana på kartan startar den direkt.</w:t>
       </w:r>
     </w:p>
     <w:p>

</xml_diff>